<commit_message>
Document CPM external author metadata actions
</commit_message>
<xml_diff>
--- a/manuscript/computational_particle_mechanics_author_email_collection_packet.docx
+++ b/manuscript/computational_particle_mechanics_author_email_collection_packet.docx
@@ -107,15 +107,17 @@
         <w:tblLook w:firstColumn="1" w:firstRow="1" w:lastColumn="0" w:lastRow="0" w:noHBand="0" w:noVBand="1" w:val="04A0"/>
       </w:tblPr>
       <w:tblGrid>
-        <w:gridCol w:w="2448"/>
-        <w:gridCol w:w="2448"/>
-        <w:gridCol w:w="2448"/>
-        <w:gridCol w:w="2448"/>
+        <w:gridCol w:w="1632"/>
+        <w:gridCol w:w="1632"/>
+        <w:gridCol w:w="1632"/>
+        <w:gridCol w:w="1632"/>
+        <w:gridCol w:w="1632"/>
+        <w:gridCol w:w="1632"/>
       </w:tblGrid>
       <w:tr>
         <w:tc>
           <w:tcPr>
-            <w:tcW w:type="dxa" w:w="2448"/>
+            <w:tcW w:type="dxa" w:w="1632"/>
           </w:tcPr>
           <w:p>
             <w:r>
@@ -125,17 +127,37 @@
         </w:tc>
         <w:tc>
           <w:tcPr>
-            <w:tcW w:type="dxa" w:w="2448"/>
+            <w:tcW w:type="dxa" w:w="1632"/>
           </w:tcPr>
           <w:p>
             <w:r>
-              <w:t>Status</w:t>
+              <w:t>Chinese name</w:t>
             </w:r>
           </w:p>
         </w:tc>
         <w:tc>
           <w:tcPr>
-            <w:tcW w:type="dxa" w:w="2448"/>
+            <w:tcW w:type="dxa" w:w="1632"/>
+          </w:tcPr>
+          <w:p>
+            <w:r>
+              <w:t>E-mail to fill or confirm</w:t>
+            </w:r>
+          </w:p>
+        </w:tc>
+        <w:tc>
+          <w:tcPr>
+            <w:tcW w:type="dxa" w:w="1632"/>
+          </w:tcPr>
+          <w:p>
+            <w:r>
+              <w:t>Confirmation status</w:t>
+            </w:r>
+          </w:p>
+        </w:tc>
+        <w:tc>
+          <w:tcPr>
+            <w:tcW w:type="dxa" w:w="1632"/>
           </w:tcPr>
           <w:p>
             <w:r>
@@ -145,7 +167,7 @@
         </w:tc>
         <w:tc>
           <w:tcPr>
-            <w:tcW w:type="dxa" w:w="2448"/>
+            <w:tcW w:type="dxa" w:w="1632"/>
           </w:tcPr>
           <w:p>
             <w:r>
@@ -157,7 +179,7 @@
       <w:tr>
         <w:tc>
           <w:tcPr>
-            <w:tcW w:type="dxa" w:w="2448"/>
+            <w:tcW w:type="dxa" w:w="1632"/>
           </w:tcPr>
           <w:p>
             <w:r>
@@ -167,17 +189,37 @@
         </w:tc>
         <w:tc>
           <w:tcPr>
-            <w:tcW w:type="dxa" w:w="2448"/>
+            <w:tcW w:type="dxa" w:w="1632"/>
           </w:tcPr>
           <w:p>
             <w:r>
-              <w:t>Missing</w:t>
+              <w:t>王思雨</w:t>
             </w:r>
           </w:p>
         </w:tc>
         <w:tc>
           <w:tcPr>
-            <w:tcW w:type="dxa" w:w="2448"/>
+            <w:tcW w:type="dxa" w:w="1632"/>
+          </w:tcPr>
+          <w:p>
+            <w:r>
+              <w:t>To be provided</w:t>
+            </w:r>
+          </w:p>
+        </w:tc>
+        <w:tc>
+          <w:tcPr>
+            <w:tcW w:type="dxa" w:w="1632"/>
+          </w:tcPr>
+          <w:p>
+            <w:r>
+              <w:t>Pending author reply</w:t>
+            </w:r>
+          </w:p>
+        </w:tc>
+        <w:tc>
+          <w:tcPr>
+            <w:tcW w:type="dxa" w:w="1632"/>
           </w:tcPr>
           <w:p>
             <w:r>
@@ -187,7 +229,7 @@
         </w:tc>
         <w:tc>
           <w:tcPr>
-            <w:tcW w:type="dxa" w:w="2448"/>
+            <w:tcW w:type="dxa" w:w="1632"/>
           </w:tcPr>
           <w:p>
             <w:r>
@@ -199,7 +241,7 @@
       <w:tr>
         <w:tc>
           <w:tcPr>
-            <w:tcW w:type="dxa" w:w="2448"/>
+            <w:tcW w:type="dxa" w:w="1632"/>
           </w:tcPr>
           <w:p>
             <w:r>
@@ -209,17 +251,37 @@
         </w:tc>
         <w:tc>
           <w:tcPr>
-            <w:tcW w:type="dxa" w:w="2448"/>
+            <w:tcW w:type="dxa" w:w="1632"/>
           </w:tcPr>
           <w:p>
             <w:r>
-              <w:t>Missing</w:t>
+              <w:t>张航</w:t>
             </w:r>
           </w:p>
         </w:tc>
         <w:tc>
           <w:tcPr>
-            <w:tcW w:type="dxa" w:w="2448"/>
+            <w:tcW w:type="dxa" w:w="1632"/>
+          </w:tcPr>
+          <w:p>
+            <w:r>
+              <w:t>To be provided</w:t>
+            </w:r>
+          </w:p>
+        </w:tc>
+        <w:tc>
+          <w:tcPr>
+            <w:tcW w:type="dxa" w:w="1632"/>
+          </w:tcPr>
+          <w:p>
+            <w:r>
+              <w:t>Pending author reply</w:t>
+            </w:r>
+          </w:p>
+        </w:tc>
+        <w:tc>
+          <w:tcPr>
+            <w:tcW w:type="dxa" w:w="1632"/>
           </w:tcPr>
           <w:p>
             <w:r>
@@ -229,7 +291,7 @@
         </w:tc>
         <w:tc>
           <w:tcPr>
-            <w:tcW w:type="dxa" w:w="2448"/>
+            <w:tcW w:type="dxa" w:w="1632"/>
           </w:tcPr>
           <w:p>
             <w:r>
@@ -241,7 +303,7 @@
       <w:tr>
         <w:tc>
           <w:tcPr>
-            <w:tcW w:type="dxa" w:w="2448"/>
+            <w:tcW w:type="dxa" w:w="1632"/>
           </w:tcPr>
           <w:p>
             <w:r>
@@ -251,17 +313,17 @@
         </w:tc>
         <w:tc>
           <w:tcPr>
-            <w:tcW w:type="dxa" w:w="2448"/>
+            <w:tcW w:type="dxa" w:w="1632"/>
           </w:tcPr>
           <w:p>
             <w:r>
-              <w:t>Missing</w:t>
+              <w:t>雷明准</w:t>
             </w:r>
           </w:p>
         </w:tc>
         <w:tc>
           <w:tcPr>
-            <w:tcW w:type="dxa" w:w="2448"/>
+            <w:tcW w:type="dxa" w:w="1632"/>
           </w:tcPr>
           <w:p>
             <w:r>
@@ -271,7 +333,27 @@
         </w:tc>
         <w:tc>
           <w:tcPr>
-            <w:tcW w:type="dxa" w:w="2448"/>
+            <w:tcW w:type="dxa" w:w="1632"/>
+          </w:tcPr>
+          <w:p>
+            <w:r>
+              <w:t>Candidate needs confirmation</w:t>
+            </w:r>
+          </w:p>
+        </w:tc>
+        <w:tc>
+          <w:tcPr>
+            <w:tcW w:type="dxa" w:w="1632"/>
+          </w:tcPr>
+          <w:p>
+            <w:r>
+              <w:t>leimz@ipp.ac.cn</w:t>
+            </w:r>
+          </w:p>
+        </w:tc>
+        <w:tc>
+          <w:tcPr>
+            <w:tcW w:type="dxa" w:w="1632"/>
           </w:tcPr>
           <w:p>
             <w:r>
@@ -283,7 +365,7 @@
       <w:tr>
         <w:tc>
           <w:tcPr>
-            <w:tcW w:type="dxa" w:w="2448"/>
+            <w:tcW w:type="dxa" w:w="1632"/>
           </w:tcPr>
           <w:p>
             <w:r>
@@ -293,17 +375,17 @@
         </w:tc>
         <w:tc>
           <w:tcPr>
-            <w:tcW w:type="dxa" w:w="2448"/>
+            <w:tcW w:type="dxa" w:w="1632"/>
           </w:tcPr>
           <w:p>
             <w:r>
-              <w:t>Missing</w:t>
+              <w:t>文伟</w:t>
             </w:r>
           </w:p>
         </w:tc>
         <w:tc>
           <w:tcPr>
-            <w:tcW w:type="dxa" w:w="2448"/>
+            <w:tcW w:type="dxa" w:w="1632"/>
           </w:tcPr>
           <w:p>
             <w:r>
@@ -313,7 +395,27 @@
         </w:tc>
         <w:tc>
           <w:tcPr>
-            <w:tcW w:type="dxa" w:w="2448"/>
+            <w:tcW w:type="dxa" w:w="1632"/>
+          </w:tcPr>
+          <w:p>
+            <w:r>
+              <w:t>Candidate needs confirmation</w:t>
+            </w:r>
+          </w:p>
+        </w:tc>
+        <w:tc>
+          <w:tcPr>
+            <w:tcW w:type="dxa" w:w="1632"/>
+          </w:tcPr>
+          <w:p>
+            <w:r>
+              <w:t>wenwei@ipp.ac.cn</w:t>
+            </w:r>
+          </w:p>
+        </w:tc>
+        <w:tc>
+          <w:tcPr>
+            <w:tcW w:type="dxa" w:w="1632"/>
           </w:tcPr>
           <w:p>
             <w:r>
@@ -325,7 +427,7 @@
       <w:tr>
         <w:tc>
           <w:tcPr>
-            <w:tcW w:type="dxa" w:w="2448"/>
+            <w:tcW w:type="dxa" w:w="1632"/>
           </w:tcPr>
           <w:p>
             <w:r>
@@ -335,17 +437,37 @@
         </w:tc>
         <w:tc>
           <w:tcPr>
-            <w:tcW w:type="dxa" w:w="2448"/>
+            <w:tcW w:type="dxa" w:w="1632"/>
           </w:tcPr>
           <w:p>
             <w:r>
-              <w:t>Missing</w:t>
+              <w:t>吴琪刚</w:t>
             </w:r>
           </w:p>
         </w:tc>
         <w:tc>
           <w:tcPr>
-            <w:tcW w:type="dxa" w:w="2448"/>
+            <w:tcW w:type="dxa" w:w="1632"/>
+          </w:tcPr>
+          <w:p>
+            <w:r>
+              <w:t>To be provided</w:t>
+            </w:r>
+          </w:p>
+        </w:tc>
+        <w:tc>
+          <w:tcPr>
+            <w:tcW w:type="dxa" w:w="1632"/>
+          </w:tcPr>
+          <w:p>
+            <w:r>
+              <w:t>Pending author reply</w:t>
+            </w:r>
+          </w:p>
+        </w:tc>
+        <w:tc>
+          <w:tcPr>
+            <w:tcW w:type="dxa" w:w="1632"/>
           </w:tcPr>
           <w:p>
             <w:r>
@@ -355,7 +477,7 @@
         </w:tc>
         <w:tc>
           <w:tcPr>
-            <w:tcW w:type="dxa" w:w="2448"/>
+            <w:tcW w:type="dxa" w:w="1632"/>
           </w:tcPr>
           <w:p>
             <w:r>
@@ -367,7 +489,7 @@
       <w:tr>
         <w:tc>
           <w:tcPr>
-            <w:tcW w:type="dxa" w:w="2448"/>
+            <w:tcW w:type="dxa" w:w="1632"/>
           </w:tcPr>
           <w:p>
             <w:r>
@@ -377,17 +499,17 @@
         </w:tc>
         <w:tc>
           <w:tcPr>
-            <w:tcW w:type="dxa" w:w="2448"/>
+            <w:tcW w:type="dxa" w:w="1632"/>
           </w:tcPr>
           <w:p>
             <w:r>
-              <w:t>Missing</w:t>
+              <w:t>沈刚</w:t>
             </w:r>
           </w:p>
         </w:tc>
         <w:tc>
           <w:tcPr>
-            <w:tcW w:type="dxa" w:w="2448"/>
+            <w:tcW w:type="dxa" w:w="1632"/>
           </w:tcPr>
           <w:p>
             <w:r>
@@ -397,7 +519,27 @@
         </w:tc>
         <w:tc>
           <w:tcPr>
-            <w:tcW w:type="dxa" w:w="2448"/>
+            <w:tcW w:type="dxa" w:w="1632"/>
+          </w:tcPr>
+          <w:p>
+            <w:r>
+              <w:t>Candidate needs confirmation</w:t>
+            </w:r>
+          </w:p>
+        </w:tc>
+        <w:tc>
+          <w:tcPr>
+            <w:tcW w:type="dxa" w:w="1632"/>
+          </w:tcPr>
+          <w:p>
+            <w:r>
+              <w:t>shenganghit@163.com</w:t>
+            </w:r>
+          </w:p>
+        </w:tc>
+        <w:tc>
+          <w:tcPr>
+            <w:tcW w:type="dxa" w:w="1632"/>
           </w:tcPr>
           <w:p>
             <w:r>
@@ -409,7 +551,7 @@
       <w:tr>
         <w:tc>
           <w:tcPr>
-            <w:tcW w:type="dxa" w:w="2448"/>
+            <w:tcW w:type="dxa" w:w="1632"/>
           </w:tcPr>
           <w:p>
             <w:r>
@@ -419,17 +561,17 @@
         </w:tc>
         <w:tc>
           <w:tcPr>
-            <w:tcW w:type="dxa" w:w="2448"/>
+            <w:tcW w:type="dxa" w:w="1632"/>
           </w:tcPr>
           <w:p>
             <w:r>
-              <w:t>Missing</w:t>
+              <w:t>邓海顺</w:t>
             </w:r>
           </w:p>
         </w:tc>
         <w:tc>
           <w:tcPr>
-            <w:tcW w:type="dxa" w:w="2448"/>
+            <w:tcW w:type="dxa" w:w="1632"/>
           </w:tcPr>
           <w:p>
             <w:r>
@@ -439,7 +581,27 @@
         </w:tc>
         <w:tc>
           <w:tcPr>
-            <w:tcW w:type="dxa" w:w="2448"/>
+            <w:tcW w:type="dxa" w:w="1632"/>
+          </w:tcPr>
+          <w:p>
+            <w:r>
+              <w:t>Candidate needs confirmation</w:t>
+            </w:r>
+          </w:p>
+        </w:tc>
+        <w:tc>
+          <w:tcPr>
+            <w:tcW w:type="dxa" w:w="1632"/>
+          </w:tcPr>
+          <w:p>
+            <w:r>
+              <w:t>269469122@qq.com</w:t>
+            </w:r>
+          </w:p>
+        </w:tc>
+        <w:tc>
+          <w:tcPr>
+            <w:tcW w:type="dxa" w:w="1632"/>
           </w:tcPr>
           <w:p>
             <w:r>

</xml_diff>